<commit_message>
Corrige le guide d'installation pour refléter la procédure réelle et les mises à jour auto
- guide-installation.html/.docx : remplace les anciennes méthodes (copie manuelle sdkjs-plugins, releases GitHub) par la procédure réellement testée (fichier .plugin fourni par l'équipe PLAI, installation via Gestionnaire de Plugins → Installer le plugin manuellement), ajoute une étape sur les mises à jour automatiques en arrière-plan, met à jour le dépannage.
- mode-emploi.docx : synchronise avec mode-emploi.html (graphies distinctes an/in, lettres à discriminer éditables).
- generate-docx.mjs : contenu désynchronisé du HTML corrigé, remis à jour pour les trois guides.

Co-Authored-By: Claude Sonnet 5 <noreply@anthropic.com>
</commit_message>
<xml_diff>
--- a/guides html/guide-installation.docx
+++ b/guides html/guide-installation.docx
@@ -84,7 +84,7 @@
         <w:spacing w:after="60"/>
       </w:pPr>
       <w:r>
-        <w:t xml:space="preserve">Connexion internet (uniquement pour le téléchargement initial)</w:t>
+        <w:t xml:space="preserve">Connexion internet au moment de l’installation, puis à chaque fois que possible ensuite — le plugin charge son contenu en ligne et se met à jour tout seul ; il reste utilisable hors ligne une fois qu’il a pu se charger au moins une fois</w:t>
       </w:r>
     </w:p>
     <w:p>
@@ -188,7 +188,7 @@
         <w:t xml:space="preserve">Étape 2 — </w:t>
       </w:r>
       <w:r>
-        <w:t xml:space="preserve">Télécharger le plugin</w:t>
+        <w:t xml:space="preserve">Récupérer le fichier du plugin</w:t>
       </w:r>
     </w:p>
     <w:p>
@@ -196,10 +196,14 @@
         <w:spacing w:after="100"/>
       </w:pPr>
       <w:r>
-        <w:rPr>
-          <w:color w:val="0A9370"/>
-        </w:rPr>
-        <w:t xml:space="preserve">https://github.com/jfb4plai/colorisation-plai-onlyoffice/releases</w:t>
+        <w:t xml:space="preserve">Le plugin est fourni par l’équipe PLAI sous la forme d’un seul fichier : </w:t>
+      </w:r>
+      <w:r>
+        <w:rPr>
+          <w:b/>
+          <w:bCs/>
+        </w:rPr>
+        <w:t xml:space="preserve">colorisation-plai.plugin</w:t>
       </w:r>
     </w:p>
     <w:p>
@@ -212,7 +216,7 @@
         <w:spacing w:after="60"/>
       </w:pPr>
       <w:r>
-        <w:t xml:space="preserve">Télécharger le fichier .zip de la dernière version</w:t>
+        <w:t xml:space="preserve">Récupérer ce fichier auprès de l’équipe PLAI (email, partage réseau, clé USB…)</w:t>
       </w:r>
     </w:p>
     <w:p>
@@ -225,14 +229,20 @@
         <w:spacing w:after="60"/>
       </w:pPr>
       <w:r>
-        <w:t xml:space="preserve">Extraire le ZIP : clic droit → </w:t>
-      </w:r>
-      <w:r>
-        <w:rPr>
-          <w:b/>
-          <w:bCs/>
-        </w:rPr>
-        <w:t xml:space="preserve">Extraire tout</w:t>
+        <w:t xml:space="preserve">L’enregistrer n’importe où sur l’ordinateur (Bureau ou Téléchargements) — il ne doit pas être décompressé</w:t>
+      </w:r>
+    </w:p>
+    <w:p>
+      <w:pPr>
+        <w:spacing w:before="80"/>
+      </w:pPr>
+      <w:r>
+        <w:rPr>
+          <w:color w:val="666666"/>
+          <w:sz w:val="18"/>
+          <w:szCs w:val="18"/>
+        </w:rPr>
+        <w:t xml:space="preserve">Code source (référence technique, pas de téléchargement) : github.com/jfb4plai/colorisation-plai-onlyoffice</w:t>
       </w:r>
     </w:p>
     <w:p>
@@ -250,15 +260,7 @@
         <w:t xml:space="preserve">Étape 3 — </w:t>
       </w:r>
       <w:r>
-        <w:t xml:space="preserve">Installer le plugin</w:t>
-      </w:r>
-    </w:p>
-    <w:p>
-      <w:pPr>
-        <w:pStyle w:val="Heading2"/>
-      </w:pPr>
-      <w:r>
-        <w:t xml:space="preserve">Méthode A — Copie manuelle (recommandée)</w:t>
+        <w:t xml:space="preserve">Installer le plugin dans OnlyOffice</w:t>
       </w:r>
     </w:p>
     <w:p>
@@ -271,7 +273,14 @@
         <w:spacing w:after="60"/>
       </w:pPr>
       <w:r>
-        <w:t xml:space="preserve">Ouvrir l'Explorateur de fichiers</w:t>
+        <w:t xml:space="preserve">Ouvrir OnlyOffice et ouvrir n’importe quel document </w:t>
+      </w:r>
+      <w:r>
+        <w:rPr>
+          <w:b/>
+          <w:bCs/>
+        </w:rPr>
+        <w:t xml:space="preserve">Word (.docx)</w:t>
       </w:r>
     </w:p>
     <w:p>
@@ -284,17 +293,24 @@
         <w:spacing w:after="60"/>
       </w:pPr>
       <w:r>
-        <w:t xml:space="preserve">Dans la barre d'adresse, taper : </w:t>
-      </w:r>
-      <w:r>
-        <w:rPr>
-          <w:b/>
-          <w:bCs/>
-        </w:rPr>
-        <w:t xml:space="preserve">%LOCALAPPDATA%</w:t>
-      </w:r>
-      <w:r>
-        <w:t xml:space="preserve"> puis Entrée</w:t>
+        <w:t xml:space="preserve">Onglet </w:t>
+      </w:r>
+      <w:r>
+        <w:rPr>
+          <w:b/>
+          <w:bCs/>
+        </w:rPr>
+        <w:t xml:space="preserve">Modules complémentaires</w:t>
+      </w:r>
+      <w:r>
+        <w:t xml:space="preserve"> → </w:t>
+      </w:r>
+      <w:r>
+        <w:rPr>
+          <w:b/>
+          <w:bCs/>
+        </w:rPr>
+        <w:t xml:space="preserve">Gestionnaire de Plugins</w:t>
       </w:r>
     </w:p>
     <w:p>
@@ -307,14 +323,17 @@
         <w:spacing w:after="60"/>
       </w:pPr>
       <w:r>
-        <w:t xml:space="preserve">Naviguer vers : </w:t>
-      </w:r>
-      <w:r>
-        <w:rPr>
-          <w:b/>
-          <w:bCs/>
-        </w:rPr>
-        <w:t xml:space="preserve">ONLYOFFICE\DesktopEditors\data\sdkjs-plugins\</w:t>
+        <w:t xml:space="preserve">Cliquer sur </w:t>
+      </w:r>
+      <w:r>
+        <w:rPr>
+          <w:b/>
+          <w:bCs/>
+        </w:rPr>
+        <w:t xml:space="preserve">Installer le plugin manuellement</w:t>
+      </w:r>
+      <w:r>
+        <w:t xml:space="preserve"> (en haut à droite)</w:t>
       </w:r>
     </w:p>
     <w:p>
@@ -327,105 +346,43 @@
         <w:spacing w:after="60"/>
       </w:pPr>
       <w:r>
-        <w:t xml:space="preserve">Copier le dossier extrait et le renommer en : </w:t>
-      </w:r>
-      <w:r>
-        <w:rPr>
-          <w:b/>
-          <w:bCs/>
-        </w:rPr>
-        <w:t xml:space="preserve">{C0L0R1Z4-PL41-0000-0000-000000000001}</w:t>
-      </w:r>
-    </w:p>
-    <w:p>
-      <w:pPr>
-        <w:pStyle w:val="ListParagraph"/>
-        <w:numPr>
-          <w:ilvl w:val="0"/>
-          <w:numId w:val="3"/>
-        </w:numPr>
-        <w:spacing w:after="60"/>
-      </w:pPr>
-      <w:r>
-        <w:t xml:space="preserve">Vérifier que </w:t>
-      </w:r>
-      <w:r>
-        <w:rPr>
-          <w:b/>
-          <w:bCs/>
-        </w:rPr>
-        <w:t xml:space="preserve">config.json</w:t>
-      </w:r>
-      <w:r>
-        <w:t xml:space="preserve"> se trouve directement dans ce dossier</w:t>
-      </w:r>
-    </w:p>
-    <w:p>
-      <w:pPr>
-        <w:pStyle w:val="Heading2"/>
-      </w:pPr>
-      <w:r>
-        <w:t xml:space="preserve">Méthode B — Via le gestionnaire de plugins</w:t>
-      </w:r>
-    </w:p>
-    <w:p>
-      <w:pPr>
-        <w:pStyle w:val="ListParagraph"/>
-        <w:numPr>
-          <w:ilvl w:val="0"/>
-          <w:numId w:val="3"/>
-        </w:numPr>
-        <w:spacing w:after="60"/>
-      </w:pPr>
-      <w:r>
-        <w:t xml:space="preserve">Ouvrir OnlyOffice → onglet </w:t>
-      </w:r>
-      <w:r>
-        <w:rPr>
-          <w:b/>
-          <w:bCs/>
-        </w:rPr>
-        <w:t xml:space="preserve">Modules complémentaires</w:t>
-      </w:r>
-    </w:p>
-    <w:p>
-      <w:pPr>
-        <w:pStyle w:val="ListParagraph"/>
-        <w:numPr>
-          <w:ilvl w:val="0"/>
-          <w:numId w:val="3"/>
-        </w:numPr>
-        <w:spacing w:after="60"/>
-      </w:pPr>
-      <w:r>
-        <w:t xml:space="preserve">Cliquer sur </w:t>
-      </w:r>
-      <w:r>
-        <w:rPr>
-          <w:b/>
-          <w:bCs/>
-        </w:rPr>
-        <w:t xml:space="preserve">Gestionnaire de Plugins</w:t>
-      </w:r>
-    </w:p>
-    <w:p>
-      <w:pPr>
-        <w:pStyle w:val="ListParagraph"/>
-        <w:numPr>
-          <w:ilvl w:val="0"/>
-          <w:numId w:val="3"/>
-        </w:numPr>
-        <w:spacing w:after="60"/>
-      </w:pPr>
-      <w:r>
-        <w:rPr>
-          <w:b/>
-          <w:bCs/>
-        </w:rPr>
-        <w:t xml:space="preserve">Installer depuis un fichier</w:t>
-      </w:r>
-      <w:r>
-        <w:t xml:space="preserve"> → sélectionner config.json</w:t>
+        <w:t xml:space="preserve">Sélectionner le fichier </w:t>
+      </w:r>
+      <w:r>
+        <w:rPr>
+          <w:b/>
+          <w:bCs/>
+        </w:rPr>
+        <w:t xml:space="preserve">colorisation-plai.plugin</w:t>
+      </w:r>
+      <w:r>
+        <w:t xml:space="preserve"> puis </w:t>
+      </w:r>
+      <w:r>
+        <w:rPr>
+          <w:b/>
+          <w:bCs/>
+        </w:rPr>
+        <w:t xml:space="preserve">Ouvrir</w:t>
+      </w:r>
+    </w:p>
+    <w:p>
+      <w:pPr>
+        <w:shd w:fill="FFFDE7" w:val="clear"/>
+        <w:spacing w:after="100"/>
+      </w:pPr>
+      <w:r>
+        <w:rPr>
+          <w:b/>
+          <w:bCs/>
+          <w:color w:val="0A9370"/>
+          <w:sz w:val="19"/>
+          <w:szCs w:val="19"/>
+        </w:rPr>
+        <w:t xml:space="preserve">Une seule fois : </w:t>
+      </w:r>
+      <w:r>
+        <w:t xml:space="preserve">cette installation ne se fait qu’une fois par ordinateur. Les mises à jour arrivent ensuite automatiquement — voir l’étape 5.</w:t>
       </w:r>
     </w:p>
     <w:p>
@@ -456,14 +413,17 @@
         <w:spacing w:after="60"/>
       </w:pPr>
       <w:r>
-        <w:rPr>
-          <w:b/>
-          <w:bCs/>
-        </w:rPr>
-        <w:t xml:space="preserve">Fermer complètement</w:t>
-      </w:r>
-      <w:r>
-        <w:t xml:space="preserve"> OnlyOffice puis le relancer</w:t>
+        <w:t xml:space="preserve">Onglet </w:t>
+      </w:r>
+      <w:r>
+        <w:rPr>
+          <w:b/>
+          <w:bCs/>
+        </w:rPr>
+        <w:t xml:space="preserve">Modules complémentaires</w:t>
+      </w:r>
+      <w:r>
+        <w:t xml:space="preserve"> → l'icône Colorisation PLAI doit apparaître (sur un document Word)</w:t>
       </w:r>
     </w:p>
     <w:p>
@@ -476,7 +436,7 @@
         <w:spacing w:after="60"/>
       </w:pPr>
       <w:r>
-        <w:t xml:space="preserve">Ouvrir un document texte (.docx)</w:t>
+        <w:t xml:space="preserve">Cliquer dessus → le panneau s'ouvre dans une fenêtre</w:t>
       </w:r>
     </w:p>
     <w:p>
@@ -489,30 +449,36 @@
         <w:spacing w:after="60"/>
       </w:pPr>
       <w:r>
-        <w:t xml:space="preserve">Onglet </w:t>
-      </w:r>
-      <w:r>
-        <w:rPr>
-          <w:b/>
-          <w:bCs/>
-        </w:rPr>
-        <w:t xml:space="preserve">Modules complémentaires</w:t>
-      </w:r>
-      <w:r>
-        <w:t xml:space="preserve"> → l'icône Colorisation PLAI doit apparaître</w:t>
-      </w:r>
-    </w:p>
-    <w:p>
-      <w:pPr>
-        <w:pStyle w:val="ListParagraph"/>
-        <w:numPr>
-          <w:ilvl w:val="0"/>
-          <w:numId w:val="3"/>
-        </w:numPr>
-        <w:spacing w:after="60"/>
-      </w:pPr>
-      <w:r>
-        <w:t xml:space="preserve">Cliquer dessus → le panneau s'ouvre</w:t>
+        <w:t xml:space="preserve">Tester rapidement : bouton </w:t>
+      </w:r>
+      <w:r>
+        <w:rPr>
+          <w:b/>
+          <w:bCs/>
+        </w:rPr>
+        <w:t xml:space="preserve">Coloriser les phonèmes</w:t>
+      </w:r>
+      <w:r>
+        <w:t xml:space="preserve"> sur un texte</w:t>
+      </w:r>
+    </w:p>
+    <w:p>
+      <w:pPr>
+        <w:shd w:fill="FFFDE7" w:val="clear"/>
+        <w:spacing w:after="100"/>
+      </w:pPr>
+      <w:r>
+        <w:rPr>
+          <w:b/>
+          <w:bCs/>
+          <w:color w:val="0A9370"/>
+          <w:sz w:val="19"/>
+          <w:szCs w:val="19"/>
+        </w:rPr>
+        <w:t xml:space="preserve">Important : </w:t>
+      </w:r>
+      <w:r>
+        <w:t xml:space="preserve">ce premier chargement se fait en ligne — rester connecté lors de ce premier essai. Une fois chargé avec succès, le plugin reste utilisable hors connexion.</w:t>
       </w:r>
     </w:p>
     <w:p>
@@ -520,6 +486,110 @@
         <w:pStyle w:val="Heading1"/>
       </w:pPr>
       <w:r>
+        <w:rPr>
+          <w:b/>
+          <w:bCs/>
+          <w:color w:val="0A9370"/>
+          <w:sz w:val="32"/>
+          <w:szCs w:val="32"/>
+        </w:rPr>
+        <w:t xml:space="preserve">Étape 5 — </w:t>
+      </w:r>
+      <w:r>
+        <w:t xml:space="preserve">Mises à jour automatiques</w:t>
+      </w:r>
+    </w:p>
+    <w:p>
+      <w:pPr>
+        <w:spacing w:after="100"/>
+      </w:pPr>
+      <w:r>
+        <w:t xml:space="preserve">Le plugin se met à jour </w:t>
+      </w:r>
+      <w:r>
+        <w:rPr>
+          <w:b/>
+          <w:bCs/>
+        </w:rPr>
+        <w:t xml:space="preserve">tout seul</w:t>
+      </w:r>
+      <w:r>
+        <w:t xml:space="preserve">, en arrière-plan, sans rien réinstaller :</w:t>
+      </w:r>
+    </w:p>
+    <w:p>
+      <w:pPr>
+        <w:pStyle w:val="ListParagraph"/>
+        <w:numPr>
+          <w:ilvl w:val="0"/>
+          <w:numId w:val="2"/>
+        </w:numPr>
+        <w:spacing w:after="60"/>
+      </w:pPr>
+      <w:r>
+        <w:t xml:space="preserve">Connecté à internet, chaque ouverture du panneau vérifie discrètement s’il existe une version plus récente</w:t>
+      </w:r>
+    </w:p>
+    <w:p>
+      <w:pPr>
+        <w:pStyle w:val="ListParagraph"/>
+        <w:numPr>
+          <w:ilvl w:val="0"/>
+          <w:numId w:val="2"/>
+        </w:numPr>
+        <w:spacing w:after="60"/>
+      </w:pPr>
+      <w:r>
+        <w:t xml:space="preserve">Si oui, elle est téléchargée en tâche de fond et prend effet à la </w:t>
+      </w:r>
+      <w:r>
+        <w:rPr>
+          <w:b/>
+          <w:bCs/>
+        </w:rPr>
+        <w:t xml:space="preserve">prochaine</w:t>
+      </w:r>
+      <w:r>
+        <w:t xml:space="preserve"> ouverture — jamais en interrompant un travail en cours</w:t>
+      </w:r>
+    </w:p>
+    <w:p>
+      <w:pPr>
+        <w:pStyle w:val="ListParagraph"/>
+        <w:numPr>
+          <w:ilvl w:val="0"/>
+          <w:numId w:val="2"/>
+        </w:numPr>
+        <w:spacing w:after="60"/>
+      </w:pPr>
+      <w:r>
+        <w:t xml:space="preserve">Sans connexion, le plugin continue de fonctionner avec la dernière version déjà enregistrée</w:t>
+      </w:r>
+    </w:p>
+    <w:p>
+      <w:pPr>
+        <w:shd w:fill="FFFDE7" w:val="clear"/>
+        <w:spacing w:after="100"/>
+      </w:pPr>
+      <w:r>
+        <w:rPr>
+          <w:b/>
+          <w:bCs/>
+          <w:color w:val="0A9370"/>
+          <w:sz w:val="19"/>
+          <w:szCs w:val="19"/>
+        </w:rPr>
+        <w:t xml:space="preserve">En clair : </w:t>
+      </w:r>
+      <w:r>
+        <w:t xml:space="preserve">une fois cette installation faite, plus besoin de la refaire — sauf annonce contraire de l’équipe PLAI (changement majeur, nouvel ordinateur…).</w:t>
+      </w:r>
+    </w:p>
+    <w:p>
+      <w:pPr>
+        <w:pStyle w:val="Heading1"/>
+      </w:pPr>
+      <w:r>
         <w:t xml:space="preserve">En cas de problème</w:t>
       </w:r>
     </w:p>
@@ -537,10 +607,10 @@
           <w:b/>
           <w:bCs/>
         </w:rPr>
-        <w:t xml:space="preserve">Le plugin n'apparaît pas ?</w:t>
-      </w:r>
-      <w:r>
-        <w:t xml:space="preserve"> → Vérifier que config.json est au premier niveau du dossier.</w:t>
+        <w:t xml:space="preserve">« Installer le plugin manuellement » n’apparaît pas ?</w:t>
+      </w:r>
+      <w:r>
+        <w:t xml:space="preserve"> → Vérifier la version d’OnlyOffice (Aide → À propos) et la mettre à jour si besoin.</w:t>
       </w:r>
     </w:p>
     <w:p>
@@ -557,10 +627,10 @@
           <w:b/>
           <w:bCs/>
         </w:rPr>
-        <w:t xml:space="preserve">Erreur au chargement ?</w:t>
-      </w:r>
-      <w:r>
-        <w:t xml:space="preserve"> → Ctrl+Shift+F12 pour ouvrir la console développeur.</w:t>
+        <w:t xml:space="preserve">Panneau vide ou erreur au premier lancement ?</w:t>
+      </w:r>
+      <w:r>
+        <w:t xml:space="preserve"> → Vérifier la connexion internet, réessayer une fois connecté.</w:t>
       </w:r>
     </w:p>
     <w:p>
@@ -577,10 +647,30 @@
           <w:b/>
           <w:bCs/>
         </w:rPr>
-        <w:t xml:space="preserve">Dossier sdkjs-plugins introuvable ?</w:t>
-      </w:r>
-      <w:r>
-        <w:t xml:space="preserve"> → Lancer OnlyOffice une première fois (le dossier est créé au 1er démarrage).</w:t>
+        <w:t xml:space="preserve">L’icône n’apparaît que sur certains documents ?</w:t>
+      </w:r>
+      <w:r>
+        <w:t xml:space="preserve"> → Normal : le plugin ne s’active que sur les documents Word (.docx).</w:t>
+      </w:r>
+    </w:p>
+    <w:p>
+      <w:pPr>
+        <w:pStyle w:val="ListParagraph"/>
+        <w:numPr>
+          <w:ilvl w:val="0"/>
+          <w:numId w:val="2"/>
+        </w:numPr>
+        <w:spacing w:after="60"/>
+      </w:pPr>
+      <w:r>
+        <w:rPr>
+          <w:b/>
+          <w:bCs/>
+        </w:rPr>
+        <w:t xml:space="preserve">Une mise à jour ne semble jamais arriver ?</w:t>
+      </w:r>
+      <w:r>
+        <w:t xml:space="preserve"> → Rouvrir le panneau avec une connexion internet active.</w:t>
       </w:r>
     </w:p>
     <w:p>

</xml_diff>